<commit_message>
Add local dev helpers + updated user guides
- _local_router.php / _local_seed.php / start-local.bat: local-only
  scaffolding to run the site against a local Postgres replica (fake
  data only; no production credentials).
- docs: refreshed Facility User Guide + HealKit Client Guide.

Co-Authored-By: Claude Opus 4.8 <noreply@anthropic.com>
</commit_message>
<xml_diff>
--- a/docs/Facility-User-Guide.docx
+++ b/docs/Facility-User-Guide.docx
@@ -21,9 +21,9 @@
           <w:lang w:val="en"/>
         </w:rPr>
         <w:drawing>
-          <wp:inline distT="0" distB="0" distL="0" distR="0" wp14:anchorId="5A746A2A" wp14:editId="3F19C66B">
-            <wp:extent cx="20314920" cy="4137660"/>
-            <wp:effectExtent l="0" t="0" r="0" b="0"/>
+          <wp:inline distT="0" distB="0" distL="0" distR="0" wp14:anchorId="5A746A2A" wp14:editId="65780301">
+            <wp:extent cx="2948940" cy="600628"/>
+            <wp:effectExtent l="0" t="0" r="3810" b="0"/>
             <wp:docPr id="1" name="Picture 1" descr="MD DME"/>
             <wp:cNvGraphicFramePr>
               <a:graphicFrameLocks xmlns:a="http://schemas.openxmlformats.org/drawingml/2006/main" noChangeAspect="1"/>
@@ -38,7 +38,1184 @@
                     </pic:cNvPicPr>
                   </pic:nvPicPr>
                   <pic:blipFill>
-                    <a:blip r:embed="rId5">
+                    <a:blip r:embed="rId5" cstate="print">
+                      <a:extLst>
+                        <a:ext uri="{28A0092B-C50C-407E-A947-70E740481C1C}">
+                          <a14:useLocalDpi xmlns:a14="http://schemas.microsoft.com/office/drawing/2010/main" val="0"/>
+                        </a:ext>
+                      </a:extLst>
+                    </a:blip>
+                    <a:srcRect/>
+                    <a:stretch>
+                      <a:fillRect/>
+                    </a:stretch>
+                  </pic:blipFill>
+                  <pic:spPr bwMode="auto">
+                    <a:xfrm>
+                      <a:off x="0" y="0"/>
+                      <a:ext cx="3025544" cy="616230"/>
+                    </a:xfrm>
+                    <a:prstGeom prst="rect">
+                      <a:avLst/>
+                    </a:prstGeom>
+                    <a:noFill/>
+                    <a:ln>
+                      <a:noFill/>
+                    </a:ln>
+                  </pic:spPr>
+                </pic:pic>
+              </a:graphicData>
+            </a:graphic>
+          </wp:inline>
+        </w:drawing>
+      </w:r>
+    </w:p>
+    <w:p>
+      <w:pPr>
+        <w:divId w:val="922838160"/>
+        <w:rPr>
+          <w:rFonts w:ascii="Manrope" w:eastAsia="Times New Roman" w:hAnsi="Manrope"/>
+          <w:b/>
+          <w:bCs/>
+          <w:caps/>
+          <w:spacing w:val="29"/>
+          <w:sz w:val="15"/>
+          <w:szCs w:val="15"/>
+          <w:lang w:val="en"/>
+        </w:rPr>
+      </w:pPr>
+      <w:r>
+        <w:rPr>
+          <w:rFonts w:ascii="Manrope" w:eastAsia="Times New Roman" w:hAnsi="Manrope"/>
+          <w:b/>
+          <w:bCs/>
+          <w:caps/>
+          <w:spacing w:val="29"/>
+          <w:sz w:val="15"/>
+          <w:szCs w:val="15"/>
+          <w:lang w:val="en"/>
+        </w:rPr>
+        <w:t>Facility User Guide</w:t>
+      </w:r>
+    </w:p>
+    <w:p>
+      <w:pPr>
+        <w:pStyle w:val="Heading1"/>
+        <w:rPr>
+          <w:rFonts w:ascii="Manrope" w:eastAsia="Times New Roman" w:hAnsi="Manrope"/>
+          <w:lang w:val="en"/>
+        </w:rPr>
+      </w:pPr>
+      <w:r>
+        <w:rPr>
+          <w:rFonts w:ascii="Manrope" w:eastAsia="Times New Roman" w:hAnsi="Manrope"/>
+          <w:lang w:val="en"/>
+        </w:rPr>
+        <w:t>Ordering</w:t>
+      </w:r>
+      <w:r>
+        <w:rPr>
+          <w:rFonts w:ascii="Manrope" w:eastAsia="Times New Roman" w:hAnsi="Manrope"/>
+          <w:lang w:val="en"/>
+        </w:rPr>
+        <w:t xml:space="preserve"> Portal — Facility Guide</w:t>
+      </w:r>
+    </w:p>
+    <w:p>
+      <w:pPr>
+        <w:divId w:val="787549787"/>
+        <w:rPr>
+          <w:rFonts w:ascii="Manrope" w:eastAsia="Times New Roman" w:hAnsi="Manrope"/>
+          <w:sz w:val="19"/>
+          <w:szCs w:val="19"/>
+          <w:lang w:val="en"/>
+        </w:rPr>
+      </w:pPr>
+      <w:r>
+        <w:rPr>
+          <w:rFonts w:ascii="Manrope" w:eastAsia="Times New Roman" w:hAnsi="Manrope"/>
+          <w:sz w:val="19"/>
+          <w:szCs w:val="19"/>
+          <w:lang w:val="en"/>
+        </w:rPr>
+        <w:t>For wound-care practices &amp; facilities · Everything you need to order supplies and track shipments</w:t>
+      </w:r>
+    </w:p>
+    <w:p>
+      <w:pPr>
+        <w:pStyle w:val="lead"/>
+        <w:rPr>
+          <w:rFonts w:ascii="Manrope" w:hAnsi="Manrope"/>
+          <w:lang w:val="en"/>
+        </w:rPr>
+      </w:pPr>
+      <w:r>
+        <w:rPr>
+          <w:rFonts w:ascii="Manrope" w:hAnsi="Manrope"/>
+          <w:lang w:val="en"/>
+        </w:rPr>
+        <w:t xml:space="preserve">Your </w:t>
+      </w:r>
+      <w:r>
+        <w:rPr>
+          <w:rFonts w:ascii="Manrope" w:hAnsi="Manrope"/>
+          <w:lang w:val="en"/>
+        </w:rPr>
+        <w:t>ordering</w:t>
+      </w:r>
+      <w:r>
+        <w:rPr>
+          <w:rFonts w:ascii="Manrope" w:hAnsi="Manrope"/>
+          <w:lang w:val="en"/>
+        </w:rPr>
+        <w:t xml:space="preserve"> portal is where you add patients, place orders, and track shipments — all in one place. This guide walks through the everyday tasks. You'll find the navigation on the left side of every screen.</w:t>
+      </w:r>
+    </w:p>
+    <w:p>
+      <w:pPr>
+        <w:pStyle w:val="Heading2"/>
+        <w:rPr>
+          <w:rFonts w:ascii="Manrope" w:eastAsia="Times New Roman" w:hAnsi="Manrope"/>
+          <w:lang w:val="en"/>
+        </w:rPr>
+      </w:pPr>
+      <w:r>
+        <w:rPr>
+          <w:rStyle w:val="n2"/>
+          <w:rFonts w:ascii="Manrope" w:eastAsia="Times New Roman" w:hAnsi="Manrope"/>
+          <w:lang w:val="en"/>
+        </w:rPr>
+        <w:t>1</w:t>
+      </w:r>
+      <w:r>
+        <w:rPr>
+          <w:rFonts w:ascii="Manrope" w:eastAsia="Times New Roman" w:hAnsi="Manrope"/>
+          <w:lang w:val="en"/>
+        </w:rPr>
+        <w:t>Getting started</w:t>
+      </w:r>
+    </w:p>
+    <w:p>
+      <w:pPr>
+        <w:numPr>
+          <w:ilvl w:val="0"/>
+          <w:numId w:val="1"/>
+        </w:numPr>
+        <w:spacing w:before="100" w:beforeAutospacing="1" w:after="45"/>
+        <w:ind w:left="1020"/>
+        <w:rPr>
+          <w:rFonts w:ascii="Manrope" w:eastAsia="Times New Roman" w:hAnsi="Manrope"/>
+          <w:sz w:val="22"/>
+          <w:szCs w:val="22"/>
+          <w:lang w:val="en"/>
+        </w:rPr>
+      </w:pPr>
+      <w:r>
+        <w:rPr>
+          <w:rFonts w:ascii="Manrope" w:eastAsia="Times New Roman" w:hAnsi="Manrope"/>
+          <w:sz w:val="22"/>
+          <w:szCs w:val="22"/>
+          <w:lang w:val="en"/>
+        </w:rPr>
+        <w:t xml:space="preserve">Go to </w:t>
+      </w:r>
+      <w:r>
+        <w:rPr>
+          <w:rFonts w:ascii="Manrope" w:eastAsia="Times New Roman" w:hAnsi="Manrope"/>
+          <w:b/>
+          <w:bCs/>
+          <w:sz w:val="22"/>
+          <w:szCs w:val="22"/>
+          <w:lang w:val="en"/>
+        </w:rPr>
+        <w:t>collagendirect.health</w:t>
+      </w:r>
+      <w:r>
+        <w:rPr>
+          <w:rFonts w:ascii="Manrope" w:eastAsia="Times New Roman" w:hAnsi="Manrope"/>
+          <w:sz w:val="22"/>
+          <w:szCs w:val="22"/>
+          <w:lang w:val="en"/>
+        </w:rPr>
+        <w:t xml:space="preserve"> and sign in with your email and password.</w:t>
+      </w:r>
+    </w:p>
+    <w:p>
+      <w:pPr>
+        <w:numPr>
+          <w:ilvl w:val="0"/>
+          <w:numId w:val="1"/>
+        </w:numPr>
+        <w:spacing w:before="100" w:beforeAutospacing="1" w:after="45"/>
+        <w:ind w:left="1020"/>
+        <w:rPr>
+          <w:rFonts w:ascii="Manrope" w:eastAsia="Times New Roman" w:hAnsi="Manrope"/>
+          <w:sz w:val="22"/>
+          <w:szCs w:val="22"/>
+          <w:lang w:val="en"/>
+        </w:rPr>
+      </w:pPr>
+      <w:r>
+        <w:rPr>
+          <w:rFonts w:ascii="Manrope" w:eastAsia="Times New Roman" w:hAnsi="Manrope"/>
+          <w:b/>
+          <w:bCs/>
+          <w:sz w:val="22"/>
+          <w:szCs w:val="22"/>
+          <w:lang w:val="en"/>
+        </w:rPr>
+        <w:t>First time?</w:t>
+      </w:r>
+      <w:r>
+        <w:rPr>
+          <w:rFonts w:ascii="Manrope" w:eastAsia="Times New Roman" w:hAnsi="Manrope"/>
+          <w:sz w:val="22"/>
+          <w:szCs w:val="22"/>
+          <w:lang w:val="en"/>
+        </w:rPr>
+        <w:t xml:space="preserve"> You'll be asked to review and accept the </w:t>
+      </w:r>
+      <w:r>
+        <w:rPr>
+          <w:rFonts w:ascii="Manrope" w:eastAsia="Times New Roman" w:hAnsi="Manrope"/>
+          <w:b/>
+          <w:bCs/>
+          <w:sz w:val="22"/>
+          <w:szCs w:val="22"/>
+          <w:lang w:val="en"/>
+        </w:rPr>
+        <w:t>MD DME Product &amp; Services Agreement</w:t>
+      </w:r>
+      <w:r>
+        <w:rPr>
+          <w:rFonts w:ascii="Manrope" w:eastAsia="Times New Roman" w:hAnsi="Manrope"/>
+          <w:sz w:val="22"/>
+          <w:szCs w:val="22"/>
+          <w:lang w:val="en"/>
+        </w:rPr>
+        <w:t xml:space="preserve"> and the </w:t>
+      </w:r>
+      <w:r>
+        <w:rPr>
+          <w:rFonts w:ascii="Manrope" w:eastAsia="Times New Roman" w:hAnsi="Manrope"/>
+          <w:b/>
+          <w:bCs/>
+          <w:sz w:val="22"/>
+          <w:szCs w:val="22"/>
+          <w:lang w:val="en"/>
+        </w:rPr>
+        <w:t>Business Associate Agreement (BAA)</w:t>
+      </w:r>
+      <w:r>
+        <w:rPr>
+          <w:rFonts w:ascii="Manrope" w:eastAsia="Times New Roman" w:hAnsi="Manrope"/>
+          <w:sz w:val="22"/>
+          <w:szCs w:val="22"/>
+          <w:lang w:val="en"/>
+        </w:rPr>
+        <w:t>. Sign once and you're in.</w:t>
+      </w:r>
+    </w:p>
+    <w:p>
+      <w:pPr>
+        <w:numPr>
+          <w:ilvl w:val="0"/>
+          <w:numId w:val="1"/>
+        </w:numPr>
+        <w:spacing w:before="100" w:beforeAutospacing="1" w:after="45"/>
+        <w:ind w:left="1020"/>
+        <w:rPr>
+          <w:rFonts w:ascii="Manrope" w:eastAsia="Times New Roman" w:hAnsi="Manrope"/>
+          <w:sz w:val="22"/>
+          <w:szCs w:val="22"/>
+          <w:lang w:val="en"/>
+        </w:rPr>
+      </w:pPr>
+      <w:r>
+        <w:rPr>
+          <w:rFonts w:ascii="Manrope" w:eastAsia="Times New Roman" w:hAnsi="Manrope"/>
+          <w:sz w:val="22"/>
+          <w:szCs w:val="22"/>
+          <w:lang w:val="en"/>
+        </w:rPr>
+        <w:t xml:space="preserve">You'll land on your </w:t>
+      </w:r>
+      <w:r>
+        <w:rPr>
+          <w:rFonts w:ascii="Manrope" w:eastAsia="Times New Roman" w:hAnsi="Manrope"/>
+          <w:b/>
+          <w:bCs/>
+          <w:sz w:val="22"/>
+          <w:szCs w:val="22"/>
+          <w:lang w:val="en"/>
+        </w:rPr>
+        <w:t>Dashboard</w:t>
+      </w:r>
+      <w:r>
+        <w:rPr>
+          <w:rFonts w:ascii="Manrope" w:eastAsia="Times New Roman" w:hAnsi="Manrope"/>
+          <w:sz w:val="22"/>
+          <w:szCs w:val="22"/>
+          <w:lang w:val="en"/>
+        </w:rPr>
+        <w:t xml:space="preserve"> — a snapshot of your patients, active orders, and recent activity.</w:t>
+      </w:r>
+    </w:p>
+    <w:p>
+      <w:pPr>
+        <w:divId w:val="1321688174"/>
+        <w:rPr>
+          <w:rFonts w:ascii="Manrope" w:eastAsia="Times New Roman" w:hAnsi="Manrope"/>
+          <w:sz w:val="16"/>
+          <w:szCs w:val="16"/>
+          <w:lang w:val="en"/>
+        </w:rPr>
+      </w:pPr>
+      <w:r>
+        <w:rPr>
+          <w:rFonts w:ascii="Manrope" w:eastAsia="Times New Roman" w:hAnsi="Manrope"/>
+          <w:b/>
+          <w:bCs/>
+          <w:sz w:val="16"/>
+          <w:szCs w:val="16"/>
+          <w:lang w:val="en"/>
+        </w:rPr>
+        <w:t>Forgot your password?</w:t>
+      </w:r>
+      <w:r>
+        <w:rPr>
+          <w:rFonts w:ascii="Manrope" w:eastAsia="Times New Roman" w:hAnsi="Manrope"/>
+          <w:sz w:val="16"/>
+          <w:szCs w:val="16"/>
+          <w:lang w:val="en"/>
+        </w:rPr>
+        <w:t xml:space="preserve"> Use the "Forgot password" link on the sign-in page. For help, contact </w:t>
+      </w:r>
+      <w:r>
+        <w:rPr>
+          <w:rFonts w:ascii="Manrope" w:eastAsia="Times New Roman" w:hAnsi="Manrope"/>
+          <w:b/>
+          <w:bCs/>
+          <w:sz w:val="16"/>
+          <w:szCs w:val="16"/>
+          <w:lang w:val="en"/>
+        </w:rPr>
+        <w:t>orders@md-dme.com</w:t>
+      </w:r>
+      <w:r>
+        <w:rPr>
+          <w:rFonts w:ascii="Manrope" w:eastAsia="Times New Roman" w:hAnsi="Manrope"/>
+          <w:sz w:val="16"/>
+          <w:szCs w:val="16"/>
+          <w:lang w:val="en"/>
+        </w:rPr>
+        <w:t>.</w:t>
+      </w:r>
+    </w:p>
+    <w:p>
+      <w:pPr>
+        <w:pStyle w:val="Heading2"/>
+        <w:rPr>
+          <w:rFonts w:ascii="Manrope" w:eastAsia="Times New Roman" w:hAnsi="Manrope"/>
+          <w:lang w:val="en"/>
+        </w:rPr>
+      </w:pPr>
+      <w:r>
+        <w:rPr>
+          <w:rStyle w:val="n2"/>
+          <w:rFonts w:ascii="Manrope" w:eastAsia="Times New Roman" w:hAnsi="Manrope"/>
+          <w:lang w:val="en"/>
+        </w:rPr>
+        <w:t>2</w:t>
+      </w:r>
+      <w:r>
+        <w:rPr>
+          <w:rFonts w:ascii="Manrope" w:eastAsia="Times New Roman" w:hAnsi="Manrope"/>
+          <w:lang w:val="en"/>
+        </w:rPr>
+        <w:t>Adding &amp; finding patients</w:t>
+      </w:r>
+    </w:p>
+    <w:p>
+      <w:pPr>
+        <w:pStyle w:val="NormalWeb"/>
+        <w:rPr>
+          <w:rFonts w:ascii="Manrope" w:hAnsi="Manrope"/>
+          <w:sz w:val="22"/>
+          <w:szCs w:val="22"/>
+          <w:lang w:val="en"/>
+        </w:rPr>
+      </w:pPr>
+      <w:r>
+        <w:rPr>
+          <w:rFonts w:ascii="Manrope" w:hAnsi="Manrope"/>
+          <w:sz w:val="22"/>
+          <w:szCs w:val="22"/>
+          <w:lang w:val="en"/>
+        </w:rPr>
+        <w:t xml:space="preserve">Open </w:t>
+      </w:r>
+      <w:r>
+        <w:rPr>
+          <w:rFonts w:ascii="Manrope" w:hAnsi="Manrope"/>
+          <w:b/>
+          <w:bCs/>
+          <w:sz w:val="22"/>
+          <w:szCs w:val="22"/>
+          <w:lang w:val="en"/>
+        </w:rPr>
+        <w:t>Patients</w:t>
+      </w:r>
+      <w:r>
+        <w:rPr>
+          <w:rFonts w:ascii="Manrope" w:hAnsi="Manrope"/>
+          <w:sz w:val="22"/>
+          <w:szCs w:val="22"/>
+          <w:lang w:val="en"/>
+        </w:rPr>
+        <w:t xml:space="preserve"> from the sidebar.</w:t>
+      </w:r>
+    </w:p>
+    <w:p>
+      <w:pPr>
+        <w:numPr>
+          <w:ilvl w:val="0"/>
+          <w:numId w:val="2"/>
+        </w:numPr>
+        <w:spacing w:before="100" w:beforeAutospacing="1" w:after="45"/>
+        <w:ind w:left="1020"/>
+        <w:rPr>
+          <w:rFonts w:ascii="Manrope" w:eastAsia="Times New Roman" w:hAnsi="Manrope"/>
+          <w:sz w:val="22"/>
+          <w:szCs w:val="22"/>
+          <w:lang w:val="en"/>
+        </w:rPr>
+      </w:pPr>
+      <w:r>
+        <w:rPr>
+          <w:rFonts w:ascii="Manrope" w:eastAsia="Times New Roman" w:hAnsi="Manrope"/>
+          <w:b/>
+          <w:bCs/>
+          <w:sz w:val="22"/>
+          <w:szCs w:val="22"/>
+          <w:lang w:val="en"/>
+        </w:rPr>
+        <w:t>Add a patient:</w:t>
+      </w:r>
+      <w:r>
+        <w:rPr>
+          <w:rFonts w:ascii="Manrope" w:eastAsia="Times New Roman" w:hAnsi="Manrope"/>
+          <w:sz w:val="22"/>
+          <w:szCs w:val="22"/>
+          <w:lang w:val="en"/>
+        </w:rPr>
+        <w:t xml:space="preserve"> click </w:t>
+      </w:r>
+      <w:r>
+        <w:rPr>
+          <w:rFonts w:ascii="Manrope" w:eastAsia="Times New Roman" w:hAnsi="Manrope"/>
+          <w:b/>
+          <w:bCs/>
+          <w:sz w:val="22"/>
+          <w:szCs w:val="22"/>
+          <w:lang w:val="en"/>
+        </w:rPr>
+        <w:t>+ New Patient</w:t>
+      </w:r>
+      <w:r>
+        <w:rPr>
+          <w:rFonts w:ascii="Manrope" w:eastAsia="Times New Roman" w:hAnsi="Manrope"/>
+          <w:sz w:val="22"/>
+          <w:szCs w:val="22"/>
+          <w:lang w:val="en"/>
+        </w:rPr>
+        <w:t xml:space="preserve"> and enter their details. Search is case-insensitive — type any part of a name to find someone.</w:t>
+      </w:r>
+    </w:p>
+    <w:p>
+      <w:pPr>
+        <w:numPr>
+          <w:ilvl w:val="0"/>
+          <w:numId w:val="2"/>
+        </w:numPr>
+        <w:spacing w:before="100" w:beforeAutospacing="1" w:after="45"/>
+        <w:ind w:left="1020"/>
+        <w:rPr>
+          <w:rFonts w:ascii="Manrope" w:eastAsia="Times New Roman" w:hAnsi="Manrope"/>
+          <w:sz w:val="22"/>
+          <w:szCs w:val="22"/>
+          <w:lang w:val="en"/>
+        </w:rPr>
+      </w:pPr>
+      <w:r>
+        <w:rPr>
+          <w:rFonts w:ascii="Manrope" w:eastAsia="Times New Roman" w:hAnsi="Manrope"/>
+          <w:sz w:val="22"/>
+          <w:szCs w:val="22"/>
+          <w:lang w:val="en"/>
+        </w:rPr>
+        <w:t>Open a patient to see their information and order history.</w:t>
+      </w:r>
+    </w:p>
+    <w:p>
+      <w:pPr>
+        <w:pStyle w:val="Heading2"/>
+        <w:rPr>
+          <w:rFonts w:ascii="Manrope" w:eastAsia="Times New Roman" w:hAnsi="Manrope"/>
+          <w:lang w:val="en"/>
+        </w:rPr>
+      </w:pPr>
+      <w:r>
+        <w:rPr>
+          <w:rStyle w:val="n2"/>
+          <w:rFonts w:ascii="Manrope" w:eastAsia="Times New Roman" w:hAnsi="Manrope"/>
+          <w:lang w:val="en"/>
+        </w:rPr>
+        <w:t>3</w:t>
+      </w:r>
+      <w:r>
+        <w:rPr>
+          <w:rFonts w:ascii="Manrope" w:eastAsia="Times New Roman" w:hAnsi="Manrope"/>
+          <w:lang w:val="en"/>
+        </w:rPr>
+        <w:t>Placing orders</w:t>
+      </w:r>
+    </w:p>
+    <w:p>
+      <w:pPr>
+        <w:pStyle w:val="NormalWeb"/>
+        <w:rPr>
+          <w:rFonts w:ascii="Manrope" w:hAnsi="Manrope"/>
+          <w:sz w:val="22"/>
+          <w:szCs w:val="22"/>
+          <w:lang w:val="en"/>
+        </w:rPr>
+      </w:pPr>
+      <w:r>
+        <w:rPr>
+          <w:rFonts w:ascii="Manrope" w:hAnsi="Manrope"/>
+          <w:sz w:val="22"/>
+          <w:szCs w:val="22"/>
+          <w:lang w:val="en"/>
+        </w:rPr>
+        <w:t>There are three order types, each on its own sidebar item. Pick the one that fits how the supplies are billed:</w:t>
+      </w:r>
+    </w:p>
+    <w:p>
+      <w:pPr>
+        <w:spacing w:before="100" w:beforeAutospacing="1" w:after="30"/>
+        <w:outlineLvl w:val="4"/>
+        <w:divId w:val="1169757066"/>
+        <w:rPr>
+          <w:rFonts w:ascii="Manrope" w:eastAsia="Times New Roman" w:hAnsi="Manrope"/>
+          <w:b/>
+          <w:bCs/>
+          <w:sz w:val="17"/>
+          <w:szCs w:val="17"/>
+          <w:lang w:val="en"/>
+        </w:rPr>
+      </w:pPr>
+      <w:r>
+        <w:rPr>
+          <w:rFonts w:ascii="Manrope" w:eastAsia="Times New Roman" w:hAnsi="Manrope"/>
+          <w:b/>
+          <w:bCs/>
+          <w:sz w:val="17"/>
+          <w:szCs w:val="17"/>
+          <w:lang w:val="en"/>
+        </w:rPr>
+        <w:t>Patient Referral</w:t>
+      </w:r>
+    </w:p>
+    <w:p>
+      <w:pPr>
+        <w:divId w:val="1169757066"/>
+        <w:rPr>
+          <w:rFonts w:ascii="Manrope" w:hAnsi="Manrope"/>
+          <w:sz w:val="15"/>
+          <w:szCs w:val="15"/>
+          <w:lang w:val="en"/>
+        </w:rPr>
+      </w:pPr>
+      <w:r>
+        <w:rPr>
+          <w:rFonts w:ascii="Manrope" w:hAnsi="Manrope"/>
+          <w:sz w:val="15"/>
+          <w:szCs w:val="15"/>
+          <w:lang w:val="en"/>
+        </w:rPr>
+        <w:t>Insurance-billed supplies for a specific patient (collagen and advanced dressings). Ships by the piece.</w:t>
+      </w:r>
+    </w:p>
+    <w:p>
+      <w:pPr>
+        <w:spacing w:before="100" w:beforeAutospacing="1" w:after="30"/>
+        <w:outlineLvl w:val="4"/>
+        <w:divId w:val="731077982"/>
+        <w:rPr>
+          <w:rFonts w:ascii="Manrope" w:eastAsia="Times New Roman" w:hAnsi="Manrope"/>
+          <w:b/>
+          <w:bCs/>
+          <w:sz w:val="17"/>
+          <w:szCs w:val="17"/>
+          <w:lang w:val="en"/>
+        </w:rPr>
+      </w:pPr>
+      <w:r>
+        <w:rPr>
+          <w:rFonts w:ascii="Manrope" w:eastAsia="Times New Roman" w:hAnsi="Manrope"/>
+          <w:b/>
+          <w:bCs/>
+          <w:sz w:val="17"/>
+          <w:szCs w:val="17"/>
+          <w:lang w:val="en"/>
+        </w:rPr>
+        <w:t>HealKit Order</w:t>
+      </w:r>
+    </w:p>
+    <w:p>
+      <w:pPr>
+        <w:divId w:val="731077982"/>
+        <w:rPr>
+          <w:rFonts w:ascii="Manrope" w:hAnsi="Manrope"/>
+          <w:sz w:val="15"/>
+          <w:szCs w:val="15"/>
+          <w:lang w:val="en"/>
+        </w:rPr>
+      </w:pPr>
+      <w:r>
+        <w:rPr>
+          <w:rFonts w:ascii="Manrope" w:hAnsi="Manrope"/>
+          <w:sz w:val="15"/>
+          <w:szCs w:val="15"/>
+          <w:lang w:val="en"/>
+        </w:rPr>
+        <w:t>Simple cash/wholesale supplies — no insurance paperwork. Ships to your office by the piece.</w:t>
+      </w:r>
+    </w:p>
+    <w:p>
+      <w:pPr>
+        <w:spacing w:before="100" w:beforeAutospacing="1" w:after="30"/>
+        <w:outlineLvl w:val="4"/>
+        <w:divId w:val="3364802"/>
+        <w:rPr>
+          <w:rFonts w:ascii="Manrope" w:eastAsia="Times New Roman" w:hAnsi="Manrope"/>
+          <w:b/>
+          <w:bCs/>
+          <w:sz w:val="17"/>
+          <w:szCs w:val="17"/>
+          <w:lang w:val="en"/>
+        </w:rPr>
+      </w:pPr>
+      <w:r>
+        <w:rPr>
+          <w:rFonts w:ascii="Manrope" w:eastAsia="Times New Roman" w:hAnsi="Manrope"/>
+          <w:b/>
+          <w:bCs/>
+          <w:sz w:val="17"/>
+          <w:szCs w:val="17"/>
+          <w:lang w:val="en"/>
+        </w:rPr>
+        <w:t>Wholesale Orders</w:t>
+      </w:r>
+    </w:p>
+    <w:p>
+      <w:pPr>
+        <w:divId w:val="3364802"/>
+        <w:rPr>
+          <w:rFonts w:ascii="Manrope" w:hAnsi="Manrope"/>
+          <w:sz w:val="15"/>
+          <w:szCs w:val="15"/>
+          <w:lang w:val="en"/>
+        </w:rPr>
+      </w:pPr>
+      <w:r>
+        <w:rPr>
+          <w:rFonts w:ascii="Manrope" w:hAnsi="Manrope"/>
+          <w:sz w:val="15"/>
+          <w:szCs w:val="15"/>
+          <w:lang w:val="en"/>
+        </w:rPr>
+        <w:t>Stock for your practice, billed to the facility and shipped by the box.</w:t>
+      </w:r>
+    </w:p>
+    <w:p>
+      <w:pPr>
+        <w:pStyle w:val="Heading3"/>
+        <w:rPr>
+          <w:rFonts w:ascii="Manrope" w:eastAsia="Times New Roman" w:hAnsi="Manrope"/>
+          <w:lang w:val="en"/>
+        </w:rPr>
+      </w:pPr>
+      <w:r>
+        <w:rPr>
+          <w:rFonts w:ascii="Manrope" w:eastAsia="Times New Roman" w:hAnsi="Manrope"/>
+          <w:lang w:val="en"/>
+        </w:rPr>
+        <w:t>Patient Referral (insurance) order</w:t>
+      </w:r>
+    </w:p>
+    <w:p>
+      <w:pPr>
+        <w:numPr>
+          <w:ilvl w:val="0"/>
+          <w:numId w:val="3"/>
+        </w:numPr>
+        <w:spacing w:before="100" w:beforeAutospacing="1" w:after="45"/>
+        <w:ind w:left="1020"/>
+        <w:rPr>
+          <w:rFonts w:ascii="Manrope" w:eastAsia="Times New Roman" w:hAnsi="Manrope"/>
+          <w:sz w:val="22"/>
+          <w:szCs w:val="22"/>
+          <w:lang w:val="en"/>
+        </w:rPr>
+      </w:pPr>
+      <w:r>
+        <w:rPr>
+          <w:rFonts w:ascii="Manrope" w:eastAsia="Times New Roman" w:hAnsi="Manrope"/>
+          <w:sz w:val="22"/>
+          <w:szCs w:val="22"/>
+          <w:lang w:val="en"/>
+        </w:rPr>
+        <w:t xml:space="preserve">Open </w:t>
+      </w:r>
+      <w:r>
+        <w:rPr>
+          <w:rFonts w:ascii="Manrope" w:eastAsia="Times New Roman" w:hAnsi="Manrope"/>
+          <w:b/>
+          <w:bCs/>
+          <w:sz w:val="22"/>
+          <w:szCs w:val="22"/>
+          <w:lang w:val="en"/>
+        </w:rPr>
+        <w:t>Patient Referral</w:t>
+      </w:r>
+      <w:r>
+        <w:rPr>
+          <w:rFonts w:ascii="Manrope" w:eastAsia="Times New Roman" w:hAnsi="Manrope"/>
+          <w:sz w:val="22"/>
+          <w:szCs w:val="22"/>
+          <w:lang w:val="en"/>
+        </w:rPr>
+        <w:t xml:space="preserve"> and choose (or add) the patient.</w:t>
+      </w:r>
+    </w:p>
+    <w:p>
+      <w:pPr>
+        <w:numPr>
+          <w:ilvl w:val="0"/>
+          <w:numId w:val="3"/>
+        </w:numPr>
+        <w:spacing w:before="100" w:beforeAutospacing="1" w:after="45"/>
+        <w:ind w:left="1020"/>
+        <w:rPr>
+          <w:rFonts w:ascii="Manrope" w:eastAsia="Times New Roman" w:hAnsi="Manrope"/>
+          <w:sz w:val="22"/>
+          <w:szCs w:val="22"/>
+          <w:lang w:val="en"/>
+        </w:rPr>
+      </w:pPr>
+      <w:r>
+        <w:rPr>
+          <w:rFonts w:ascii="Manrope" w:eastAsia="Times New Roman" w:hAnsi="Manrope"/>
+          <w:sz w:val="22"/>
+          <w:szCs w:val="22"/>
+          <w:lang w:val="en"/>
+        </w:rPr>
+        <w:t xml:space="preserve">Add the wound(s) and pick the </w:t>
+      </w:r>
+      <w:r>
+        <w:rPr>
+          <w:rFonts w:ascii="Manrope" w:eastAsia="Times New Roman" w:hAnsi="Manrope"/>
+          <w:b/>
+          <w:bCs/>
+          <w:sz w:val="22"/>
+          <w:szCs w:val="22"/>
+          <w:lang w:val="en"/>
+        </w:rPr>
+        <w:t>product type</w:t>
+      </w:r>
+      <w:r>
+        <w:rPr>
+          <w:rFonts w:ascii="Manrope" w:eastAsia="Times New Roman" w:hAnsi="Manrope"/>
+          <w:sz w:val="22"/>
+          <w:szCs w:val="22"/>
+          <w:lang w:val="en"/>
+        </w:rPr>
+        <w:t xml:space="preserve"> and </w:t>
+      </w:r>
+      <w:r>
+        <w:rPr>
+          <w:rFonts w:ascii="Manrope" w:eastAsia="Times New Roman" w:hAnsi="Manrope"/>
+          <w:b/>
+          <w:bCs/>
+          <w:sz w:val="22"/>
+          <w:szCs w:val="22"/>
+          <w:lang w:val="en"/>
+        </w:rPr>
+        <w:t>size</w:t>
+      </w:r>
+      <w:r>
+        <w:rPr>
+          <w:rFonts w:ascii="Manrope" w:eastAsia="Times New Roman" w:hAnsi="Manrope"/>
+          <w:sz w:val="22"/>
+          <w:szCs w:val="22"/>
+          <w:lang w:val="en"/>
+        </w:rPr>
+        <w:t>, then set quantity, frequency, and duration.</w:t>
+      </w:r>
+    </w:p>
+    <w:p>
+      <w:pPr>
+        <w:numPr>
+          <w:ilvl w:val="0"/>
+          <w:numId w:val="3"/>
+        </w:numPr>
+        <w:spacing w:before="100" w:beforeAutospacing="1" w:after="45"/>
+        <w:ind w:left="1020"/>
+        <w:rPr>
+          <w:rFonts w:ascii="Manrope" w:eastAsia="Times New Roman" w:hAnsi="Manrope"/>
+          <w:sz w:val="22"/>
+          <w:szCs w:val="22"/>
+          <w:lang w:val="en"/>
+        </w:rPr>
+      </w:pPr>
+      <w:r>
+        <w:rPr>
+          <w:rFonts w:ascii="Manrope" w:eastAsia="Times New Roman" w:hAnsi="Manrope"/>
+          <w:sz w:val="22"/>
+          <w:szCs w:val="22"/>
+          <w:lang w:val="en"/>
+        </w:rPr>
+        <w:lastRenderedPageBreak/>
+        <w:t>Attach any required documentation, sign, and submit.</w:t>
+      </w:r>
+    </w:p>
+    <w:p>
+      <w:pPr>
+        <w:pStyle w:val="Heading3"/>
+        <w:rPr>
+          <w:rFonts w:ascii="Manrope" w:eastAsia="Times New Roman" w:hAnsi="Manrope"/>
+          <w:lang w:val="en"/>
+        </w:rPr>
+      </w:pPr>
+      <w:r>
+        <w:rPr>
+          <w:rFonts w:ascii="Manrope" w:eastAsia="Times New Roman" w:hAnsi="Manrope"/>
+          <w:lang w:val="en"/>
+        </w:rPr>
+        <w:t>HealKit order</w:t>
+      </w:r>
+    </w:p>
+    <w:p>
+      <w:pPr>
+        <w:numPr>
+          <w:ilvl w:val="0"/>
+          <w:numId w:val="4"/>
+        </w:numPr>
+        <w:spacing w:before="100" w:beforeAutospacing="1" w:after="45"/>
+        <w:ind w:left="1020"/>
+        <w:rPr>
+          <w:rFonts w:ascii="Manrope" w:eastAsia="Times New Roman" w:hAnsi="Manrope"/>
+          <w:sz w:val="22"/>
+          <w:szCs w:val="22"/>
+          <w:lang w:val="en"/>
+        </w:rPr>
+      </w:pPr>
+      <w:r>
+        <w:rPr>
+          <w:rFonts w:ascii="Manrope" w:eastAsia="Times New Roman" w:hAnsi="Manrope"/>
+          <w:sz w:val="22"/>
+          <w:szCs w:val="22"/>
+          <w:lang w:val="en"/>
+        </w:rPr>
+        <w:t xml:space="preserve">Open </w:t>
+      </w:r>
+      <w:r>
+        <w:rPr>
+          <w:rFonts w:ascii="Manrope" w:eastAsia="Times New Roman" w:hAnsi="Manrope"/>
+          <w:b/>
+          <w:bCs/>
+          <w:sz w:val="22"/>
+          <w:szCs w:val="22"/>
+          <w:lang w:val="en"/>
+        </w:rPr>
+        <w:t>HealKit Order</w:t>
+      </w:r>
+      <w:r>
+        <w:rPr>
+          <w:rFonts w:ascii="Manrope" w:eastAsia="Times New Roman" w:hAnsi="Manrope"/>
+          <w:sz w:val="22"/>
+          <w:szCs w:val="22"/>
+          <w:lang w:val="en"/>
+        </w:rPr>
+        <w:t>. New patients need only a first and last name — no insurance docs required.</w:t>
+      </w:r>
+    </w:p>
+    <w:p>
+      <w:pPr>
+        <w:numPr>
+          <w:ilvl w:val="0"/>
+          <w:numId w:val="4"/>
+        </w:numPr>
+        <w:spacing w:before="100" w:beforeAutospacing="1" w:after="45"/>
+        <w:ind w:left="1020"/>
+        <w:rPr>
+          <w:rFonts w:ascii="Manrope" w:eastAsia="Times New Roman" w:hAnsi="Manrope"/>
+          <w:sz w:val="22"/>
+          <w:szCs w:val="22"/>
+          <w:lang w:val="en"/>
+        </w:rPr>
+      </w:pPr>
+      <w:r>
+        <w:rPr>
+          <w:rFonts w:ascii="Manrope" w:eastAsia="Times New Roman" w:hAnsi="Manrope"/>
+          <w:sz w:val="22"/>
+          <w:szCs w:val="22"/>
+          <w:lang w:val="en"/>
+        </w:rPr>
+        <w:t>Confirm delivery (defaults to your office; choose another location if needed).</w:t>
+      </w:r>
+    </w:p>
+    <w:p>
+      <w:pPr>
+        <w:numPr>
+          <w:ilvl w:val="0"/>
+          <w:numId w:val="4"/>
+        </w:numPr>
+        <w:spacing w:before="100" w:beforeAutospacing="1" w:after="45"/>
+        <w:ind w:left="1020"/>
+        <w:rPr>
+          <w:rFonts w:ascii="Manrope" w:eastAsia="Times New Roman" w:hAnsi="Manrope"/>
+          <w:sz w:val="22"/>
+          <w:szCs w:val="22"/>
+          <w:lang w:val="en"/>
+        </w:rPr>
+      </w:pPr>
+      <w:r>
+        <w:rPr>
+          <w:rFonts w:ascii="Manrope" w:eastAsia="Times New Roman" w:hAnsi="Manrope"/>
+          <w:sz w:val="22"/>
+          <w:szCs w:val="22"/>
+          <w:lang w:val="en"/>
+        </w:rPr>
+        <w:t>Pick product type and size, set the quantity, sign, and submit.</w:t>
+      </w:r>
+    </w:p>
+    <w:p>
+      <w:pPr>
+        <w:divId w:val="1110125022"/>
+        <w:rPr>
+          <w:rFonts w:ascii="Manrope" w:eastAsia="Times New Roman" w:hAnsi="Manrope"/>
+          <w:sz w:val="16"/>
+          <w:szCs w:val="16"/>
+          <w:lang w:val="en"/>
+        </w:rPr>
+      </w:pPr>
+      <w:r>
+        <w:rPr>
+          <w:rFonts w:ascii="Manrope" w:eastAsia="Times New Roman" w:hAnsi="Manrope"/>
+          <w:b/>
+          <w:bCs/>
+          <w:sz w:val="16"/>
+          <w:szCs w:val="16"/>
+          <w:lang w:val="en"/>
+        </w:rPr>
+        <w:t>What's the difference?</w:t>
+      </w:r>
+      <w:r>
+        <w:rPr>
+          <w:rFonts w:ascii="Manrope" w:eastAsia="Times New Roman" w:hAnsi="Manrope"/>
+          <w:sz w:val="16"/>
+          <w:szCs w:val="16"/>
+          <w:lang w:val="en"/>
+        </w:rPr>
+        <w:t xml:space="preserve"> HealKit skips insurance verification and ships straight to your office at simple wholesale pricing — great when you don't need to bill a patient's insurance. See the dedicated </w:t>
+      </w:r>
+      <w:r>
+        <w:rPr>
+          <w:rFonts w:ascii="Manrope" w:eastAsia="Times New Roman" w:hAnsi="Manrope"/>
+          <w:b/>
+          <w:bCs/>
+          <w:sz w:val="16"/>
+          <w:szCs w:val="16"/>
+          <w:lang w:val="en"/>
+        </w:rPr>
+        <w:t>"Introducing HealKit"</w:t>
+      </w:r>
+      <w:r>
+        <w:rPr>
+          <w:rFonts w:ascii="Manrope" w:eastAsia="Times New Roman" w:hAnsi="Manrope"/>
+          <w:sz w:val="16"/>
+          <w:szCs w:val="16"/>
+          <w:lang w:val="en"/>
+        </w:rPr>
+        <w:t xml:space="preserve"> handout for details.</w:t>
+      </w:r>
+    </w:p>
+    <w:p>
+      <w:pPr>
+        <w:pStyle w:val="Heading3"/>
+        <w:rPr>
+          <w:rFonts w:ascii="Manrope" w:eastAsia="Times New Roman" w:hAnsi="Manrope"/>
+          <w:lang w:val="en"/>
+        </w:rPr>
+      </w:pPr>
+      <w:r>
+        <w:rPr>
+          <w:rFonts w:ascii="Manrope" w:eastAsia="Times New Roman" w:hAnsi="Manrope"/>
+          <w:lang w:val="en"/>
+        </w:rPr>
+        <w:t>Wholesale order</w:t>
+      </w:r>
+    </w:p>
+    <w:p>
+      <w:pPr>
+        <w:numPr>
+          <w:ilvl w:val="0"/>
+          <w:numId w:val="5"/>
+        </w:numPr>
+        <w:spacing w:before="100" w:beforeAutospacing="1" w:after="45"/>
+        <w:ind w:left="1020"/>
+        <w:rPr>
+          <w:rFonts w:ascii="Manrope" w:eastAsia="Times New Roman" w:hAnsi="Manrope"/>
+          <w:sz w:val="22"/>
+          <w:szCs w:val="22"/>
+          <w:lang w:val="en"/>
+        </w:rPr>
+      </w:pPr>
+      <w:r>
+        <w:rPr>
+          <w:rFonts w:ascii="Manrope" w:eastAsia="Times New Roman" w:hAnsi="Manrope"/>
+          <w:sz w:val="22"/>
+          <w:szCs w:val="22"/>
+          <w:lang w:val="en"/>
+        </w:rPr>
+        <w:t xml:space="preserve">Open </w:t>
+      </w:r>
+      <w:r>
+        <w:rPr>
+          <w:rFonts w:ascii="Manrope" w:eastAsia="Times New Roman" w:hAnsi="Manrope"/>
+          <w:b/>
+          <w:bCs/>
+          <w:sz w:val="22"/>
+          <w:szCs w:val="22"/>
+          <w:lang w:val="en"/>
+        </w:rPr>
+        <w:t>Wholesale Orders</w:t>
+      </w:r>
+      <w:r>
+        <w:rPr>
+          <w:rFonts w:ascii="Manrope" w:eastAsia="Times New Roman" w:hAnsi="Manrope"/>
+          <w:sz w:val="22"/>
+          <w:szCs w:val="22"/>
+          <w:lang w:val="en"/>
+        </w:rPr>
+        <w:t xml:space="preserve"> → </w:t>
+      </w:r>
+      <w:r>
+        <w:rPr>
+          <w:rFonts w:ascii="Manrope" w:eastAsia="Times New Roman" w:hAnsi="Manrope"/>
+          <w:b/>
+          <w:bCs/>
+          <w:sz w:val="22"/>
+          <w:szCs w:val="22"/>
+          <w:lang w:val="en"/>
+        </w:rPr>
+        <w:t>Create</w:t>
+      </w:r>
+      <w:r>
+        <w:rPr>
+          <w:rFonts w:ascii="Manrope" w:eastAsia="Times New Roman" w:hAnsi="Manrope"/>
+          <w:sz w:val="22"/>
+          <w:szCs w:val="22"/>
+          <w:lang w:val="en"/>
+        </w:rPr>
+        <w:t>.</w:t>
+      </w:r>
+    </w:p>
+    <w:p>
+      <w:pPr>
+        <w:numPr>
+          <w:ilvl w:val="0"/>
+          <w:numId w:val="5"/>
+        </w:numPr>
+        <w:spacing w:before="100" w:beforeAutospacing="1" w:after="45"/>
+        <w:ind w:left="1020"/>
+        <w:rPr>
+          <w:rFonts w:ascii="Manrope" w:eastAsia="Times New Roman" w:hAnsi="Manrope"/>
+          <w:sz w:val="22"/>
+          <w:szCs w:val="22"/>
+          <w:lang w:val="en"/>
+        </w:rPr>
+      </w:pPr>
+      <w:r>
+        <w:rPr>
+          <w:rFonts w:ascii="Manrope" w:eastAsia="Times New Roman" w:hAnsi="Manrope"/>
+          <w:sz w:val="22"/>
+          <w:szCs w:val="22"/>
+          <w:lang w:val="en"/>
+        </w:rPr>
+        <w:t>Wholesale orders ship to your facility (not a patient). Choose products and quantities (by the box) and submit.</w:t>
+      </w:r>
+    </w:p>
+    <w:p>
+      <w:pPr>
+        <w:divId w:val="2108915043"/>
+        <w:rPr>
+          <w:rFonts w:ascii="Manrope" w:eastAsia="Times New Roman" w:hAnsi="Manrope"/>
+          <w:sz w:val="14"/>
+          <w:szCs w:val="14"/>
+          <w:lang w:val="en"/>
+        </w:rPr>
+      </w:pPr>
+      <w:r>
+        <w:rPr>
+          <w:rFonts w:ascii="Manrope" w:eastAsia="Times New Roman" w:hAnsi="Manrope"/>
+          <w:sz w:val="14"/>
+          <w:szCs w:val="14"/>
+          <w:lang w:val="en"/>
+        </w:rPr>
+        <w:t>CollagenDirect · MD DME — Advanced Wound Care, SimplifiedQuestions? orders@md-dme.com</w:t>
+      </w:r>
+    </w:p>
+    <w:p>
+      <w:pPr>
+        <w:divId w:val="568538940"/>
+        <w:rPr>
+          <w:rFonts w:ascii="Manrope" w:eastAsia="Times New Roman" w:hAnsi="Manrope"/>
+          <w:sz w:val="22"/>
+          <w:szCs w:val="22"/>
+          <w:lang w:val="en"/>
+        </w:rPr>
+      </w:pPr>
+      <w:r>
+        <w:rPr>
+          <w:rFonts w:ascii="Manrope" w:eastAsia="Times New Roman" w:hAnsi="Manrope"/>
+          <w:noProof/>
+          <w:sz w:val="22"/>
+          <w:szCs w:val="22"/>
+          <w:lang w:val="en"/>
+        </w:rPr>
+        <w:drawing>
+          <wp:inline distT="0" distB="0" distL="0" distR="0" wp14:anchorId="5ADDC5B2" wp14:editId="08F61ACE">
+            <wp:extent cx="20314920" cy="4137660"/>
+            <wp:effectExtent l="0" t="0" r="0" b="0"/>
+            <wp:docPr id="2" name="Picture 2" descr="MD DME"/>
+            <wp:cNvGraphicFramePr>
+              <a:graphicFrameLocks xmlns:a="http://schemas.openxmlformats.org/drawingml/2006/main" noChangeAspect="1"/>
+            </wp:cNvGraphicFramePr>
+            <a:graphic xmlns:a="http://schemas.openxmlformats.org/drawingml/2006/main">
+              <a:graphicData uri="http://schemas.openxmlformats.org/drawingml/2006/picture">
+                <pic:pic xmlns:pic="http://schemas.openxmlformats.org/drawingml/2006/picture">
+                  <pic:nvPicPr>
+                    <pic:cNvPr id="0" name="Picture 2" descr="MD DME"/>
+                    <pic:cNvPicPr>
+                      <a:picLocks noChangeAspect="1" noChangeArrowheads="1"/>
+                    </pic:cNvPicPr>
+                  </pic:nvPicPr>
+                  <pic:blipFill>
+                    <a:blip r:embed="rId6">
                       <a:extLst>
                         <a:ext uri="{28A0092B-C50C-407E-A947-70E740481C1C}">
                           <a14:useLocalDpi xmlns:a14="http://schemas.microsoft.com/office/drawing/2010/main" val="0"/>
@@ -72,1172 +1249,6 @@
     </w:p>
     <w:p>
       <w:pPr>
-        <w:divId w:val="922838160"/>
-        <w:rPr>
-          <w:rFonts w:ascii="Manrope" w:eastAsia="Times New Roman" w:hAnsi="Manrope"/>
-          <w:b/>
-          <w:bCs/>
-          <w:caps/>
-          <w:spacing w:val="29"/>
-          <w:sz w:val="15"/>
-          <w:szCs w:val="15"/>
-          <w:lang w:val="en"/>
-        </w:rPr>
-      </w:pPr>
-      <w:r>
-        <w:rPr>
-          <w:rFonts w:ascii="Manrope" w:eastAsia="Times New Roman" w:hAnsi="Manrope"/>
-          <w:b/>
-          <w:bCs/>
-          <w:caps/>
-          <w:spacing w:val="29"/>
-          <w:sz w:val="15"/>
-          <w:szCs w:val="15"/>
-          <w:lang w:val="en"/>
-        </w:rPr>
-        <w:t>Facility User Guide</w:t>
-      </w:r>
-    </w:p>
-    <w:p>
-      <w:pPr>
-        <w:pStyle w:val="Heading1"/>
-        <w:rPr>
-          <w:rFonts w:ascii="Manrope" w:eastAsia="Times New Roman" w:hAnsi="Manrope"/>
-          <w:lang w:val="en"/>
-        </w:rPr>
-      </w:pPr>
-      <w:r>
-        <w:rPr>
-          <w:rFonts w:ascii="Manrope" w:eastAsia="Times New Roman" w:hAnsi="Manrope"/>
-          <w:lang w:val="en"/>
-        </w:rPr>
-        <w:t>CollagenDirect Portal — Facility Guide</w:t>
-      </w:r>
-    </w:p>
-    <w:p>
-      <w:pPr>
-        <w:divId w:val="787549787"/>
-        <w:rPr>
-          <w:rFonts w:ascii="Manrope" w:eastAsia="Times New Roman" w:hAnsi="Manrope"/>
-          <w:sz w:val="19"/>
-          <w:szCs w:val="19"/>
-          <w:lang w:val="en"/>
-        </w:rPr>
-      </w:pPr>
-      <w:r>
-        <w:rPr>
-          <w:rFonts w:ascii="Manrope" w:eastAsia="Times New Roman" w:hAnsi="Manrope"/>
-          <w:sz w:val="19"/>
-          <w:szCs w:val="19"/>
-          <w:lang w:val="en"/>
-        </w:rPr>
-        <w:t>For wound-care practices &amp; facilities · Everything you need to order supplies and track shipments</w:t>
-      </w:r>
-    </w:p>
-    <w:p>
-      <w:pPr>
-        <w:pStyle w:val="lead"/>
-        <w:rPr>
-          <w:rFonts w:ascii="Manrope" w:hAnsi="Manrope"/>
-          <w:lang w:val="en"/>
-        </w:rPr>
-      </w:pPr>
-      <w:r>
-        <w:rPr>
-          <w:rFonts w:ascii="Manrope" w:hAnsi="Manrope"/>
-          <w:lang w:val="en"/>
-        </w:rPr>
-        <w:t>Your CollagenDirect portal is where you add patients, place orders, and track shipments — all in one place. This guide walks through the everyday tasks. You'll find the navigation on the left side of every screen.</w:t>
-      </w:r>
-    </w:p>
-    <w:p>
-      <w:pPr>
-        <w:pStyle w:val="Heading2"/>
-        <w:rPr>
-          <w:rFonts w:ascii="Manrope" w:eastAsia="Times New Roman" w:hAnsi="Manrope"/>
-          <w:lang w:val="en"/>
-        </w:rPr>
-      </w:pPr>
-      <w:r>
-        <w:rPr>
-          <w:rStyle w:val="n2"/>
-          <w:rFonts w:ascii="Manrope" w:eastAsia="Times New Roman" w:hAnsi="Manrope"/>
-          <w:lang w:val="en"/>
-        </w:rPr>
-        <w:t>1</w:t>
-      </w:r>
-      <w:r>
-        <w:rPr>
-          <w:rFonts w:ascii="Manrope" w:eastAsia="Times New Roman" w:hAnsi="Manrope"/>
-          <w:lang w:val="en"/>
-        </w:rPr>
-        <w:t>Getting started</w:t>
-      </w:r>
-    </w:p>
-    <w:p>
-      <w:pPr>
-        <w:numPr>
-          <w:ilvl w:val="0"/>
-          <w:numId w:val="1"/>
-        </w:numPr>
-        <w:spacing w:before="100" w:beforeAutospacing="1" w:after="45"/>
-        <w:ind w:left="1020"/>
-        <w:rPr>
-          <w:rFonts w:ascii="Manrope" w:eastAsia="Times New Roman" w:hAnsi="Manrope"/>
-          <w:sz w:val="22"/>
-          <w:szCs w:val="22"/>
-          <w:lang w:val="en"/>
-        </w:rPr>
-      </w:pPr>
-      <w:r>
-        <w:rPr>
-          <w:rFonts w:ascii="Manrope" w:eastAsia="Times New Roman" w:hAnsi="Manrope"/>
-          <w:sz w:val="22"/>
-          <w:szCs w:val="22"/>
-          <w:lang w:val="en"/>
-        </w:rPr>
-        <w:t xml:space="preserve">Go to </w:t>
-      </w:r>
-      <w:r>
-        <w:rPr>
-          <w:rFonts w:ascii="Manrope" w:eastAsia="Times New Roman" w:hAnsi="Manrope"/>
-          <w:b/>
-          <w:bCs/>
-          <w:sz w:val="22"/>
-          <w:szCs w:val="22"/>
-          <w:lang w:val="en"/>
-        </w:rPr>
-        <w:t>collagendirect.health</w:t>
-      </w:r>
-      <w:r>
-        <w:rPr>
-          <w:rFonts w:ascii="Manrope" w:eastAsia="Times New Roman" w:hAnsi="Manrope"/>
-          <w:sz w:val="22"/>
-          <w:szCs w:val="22"/>
-          <w:lang w:val="en"/>
-        </w:rPr>
-        <w:t xml:space="preserve"> and sign in with your email and password.</w:t>
-      </w:r>
-    </w:p>
-    <w:p>
-      <w:pPr>
-        <w:numPr>
-          <w:ilvl w:val="0"/>
-          <w:numId w:val="1"/>
-        </w:numPr>
-        <w:spacing w:before="100" w:beforeAutospacing="1" w:after="45"/>
-        <w:ind w:left="1020"/>
-        <w:rPr>
-          <w:rFonts w:ascii="Manrope" w:eastAsia="Times New Roman" w:hAnsi="Manrope"/>
-          <w:sz w:val="22"/>
-          <w:szCs w:val="22"/>
-          <w:lang w:val="en"/>
-        </w:rPr>
-      </w:pPr>
-      <w:r>
-        <w:rPr>
-          <w:rFonts w:ascii="Manrope" w:eastAsia="Times New Roman" w:hAnsi="Manrope"/>
-          <w:b/>
-          <w:bCs/>
-          <w:sz w:val="22"/>
-          <w:szCs w:val="22"/>
-          <w:lang w:val="en"/>
-        </w:rPr>
-        <w:t>First time?</w:t>
-      </w:r>
-      <w:r>
-        <w:rPr>
-          <w:rFonts w:ascii="Manrope" w:eastAsia="Times New Roman" w:hAnsi="Manrope"/>
-          <w:sz w:val="22"/>
-          <w:szCs w:val="22"/>
-          <w:lang w:val="en"/>
-        </w:rPr>
-        <w:t xml:space="preserve"> You'll be asked to review and accept the </w:t>
-      </w:r>
-      <w:r>
-        <w:rPr>
-          <w:rFonts w:ascii="Manrope" w:eastAsia="Times New Roman" w:hAnsi="Manrope"/>
-          <w:b/>
-          <w:bCs/>
-          <w:sz w:val="22"/>
-          <w:szCs w:val="22"/>
-          <w:lang w:val="en"/>
-        </w:rPr>
-        <w:t>MD DME Product &amp; Services Agreement</w:t>
-      </w:r>
-      <w:r>
-        <w:rPr>
-          <w:rFonts w:ascii="Manrope" w:eastAsia="Times New Roman" w:hAnsi="Manrope"/>
-          <w:sz w:val="22"/>
-          <w:szCs w:val="22"/>
-          <w:lang w:val="en"/>
-        </w:rPr>
-        <w:t xml:space="preserve"> and the </w:t>
-      </w:r>
-      <w:r>
-        <w:rPr>
-          <w:rFonts w:ascii="Manrope" w:eastAsia="Times New Roman" w:hAnsi="Manrope"/>
-          <w:b/>
-          <w:bCs/>
-          <w:sz w:val="22"/>
-          <w:szCs w:val="22"/>
-          <w:lang w:val="en"/>
-        </w:rPr>
-        <w:t>Business Associate Agreement (BAA)</w:t>
-      </w:r>
-      <w:r>
-        <w:rPr>
-          <w:rFonts w:ascii="Manrope" w:eastAsia="Times New Roman" w:hAnsi="Manrope"/>
-          <w:sz w:val="22"/>
-          <w:szCs w:val="22"/>
-          <w:lang w:val="en"/>
-        </w:rPr>
-        <w:t>. Sign once and you're in.</w:t>
-      </w:r>
-    </w:p>
-    <w:p>
-      <w:pPr>
-        <w:numPr>
-          <w:ilvl w:val="0"/>
-          <w:numId w:val="1"/>
-        </w:numPr>
-        <w:spacing w:before="100" w:beforeAutospacing="1" w:after="45"/>
-        <w:ind w:left="1020"/>
-        <w:rPr>
-          <w:rFonts w:ascii="Manrope" w:eastAsia="Times New Roman" w:hAnsi="Manrope"/>
-          <w:sz w:val="22"/>
-          <w:szCs w:val="22"/>
-          <w:lang w:val="en"/>
-        </w:rPr>
-      </w:pPr>
-      <w:r>
-        <w:rPr>
-          <w:rFonts w:ascii="Manrope" w:eastAsia="Times New Roman" w:hAnsi="Manrope"/>
-          <w:sz w:val="22"/>
-          <w:szCs w:val="22"/>
-          <w:lang w:val="en"/>
-        </w:rPr>
-        <w:t xml:space="preserve">You'll land on your </w:t>
-      </w:r>
-      <w:r>
-        <w:rPr>
-          <w:rFonts w:ascii="Manrope" w:eastAsia="Times New Roman" w:hAnsi="Manrope"/>
-          <w:b/>
-          <w:bCs/>
-          <w:sz w:val="22"/>
-          <w:szCs w:val="22"/>
-          <w:lang w:val="en"/>
-        </w:rPr>
-        <w:t>Dashboard</w:t>
-      </w:r>
-      <w:r>
-        <w:rPr>
-          <w:rFonts w:ascii="Manrope" w:eastAsia="Times New Roman" w:hAnsi="Manrope"/>
-          <w:sz w:val="22"/>
-          <w:szCs w:val="22"/>
-          <w:lang w:val="en"/>
-        </w:rPr>
-        <w:t xml:space="preserve"> — a snapshot of your patients, active orders, and recent activity.</w:t>
-      </w:r>
-    </w:p>
-    <w:p>
-      <w:pPr>
-        <w:divId w:val="1321688174"/>
-        <w:rPr>
-          <w:rFonts w:ascii="Manrope" w:eastAsia="Times New Roman" w:hAnsi="Manrope"/>
-          <w:sz w:val="16"/>
-          <w:szCs w:val="16"/>
-          <w:lang w:val="en"/>
-        </w:rPr>
-      </w:pPr>
-      <w:r>
-        <w:rPr>
-          <w:rFonts w:ascii="Manrope" w:eastAsia="Times New Roman" w:hAnsi="Manrope"/>
-          <w:b/>
-          <w:bCs/>
-          <w:sz w:val="16"/>
-          <w:szCs w:val="16"/>
-          <w:lang w:val="en"/>
-        </w:rPr>
-        <w:t>Forgot your password?</w:t>
-      </w:r>
-      <w:r>
-        <w:rPr>
-          <w:rFonts w:ascii="Manrope" w:eastAsia="Times New Roman" w:hAnsi="Manrope"/>
-          <w:sz w:val="16"/>
-          <w:szCs w:val="16"/>
-          <w:lang w:val="en"/>
-        </w:rPr>
-        <w:t xml:space="preserve"> Use the "Forgot password" link on the sign-in page. For help, contact </w:t>
-      </w:r>
-      <w:r>
-        <w:rPr>
-          <w:rFonts w:ascii="Manrope" w:eastAsia="Times New Roman" w:hAnsi="Manrope"/>
-          <w:b/>
-          <w:bCs/>
-          <w:sz w:val="16"/>
-          <w:szCs w:val="16"/>
-          <w:lang w:val="en"/>
-        </w:rPr>
-        <w:t>orders@md-dme.com</w:t>
-      </w:r>
-      <w:r>
-        <w:rPr>
-          <w:rFonts w:ascii="Manrope" w:eastAsia="Times New Roman" w:hAnsi="Manrope"/>
-          <w:sz w:val="16"/>
-          <w:szCs w:val="16"/>
-          <w:lang w:val="en"/>
-        </w:rPr>
-        <w:t>.</w:t>
-      </w:r>
-    </w:p>
-    <w:p>
-      <w:pPr>
-        <w:pStyle w:val="Heading2"/>
-        <w:rPr>
-          <w:rFonts w:ascii="Manrope" w:eastAsia="Times New Roman" w:hAnsi="Manrope"/>
-          <w:lang w:val="en"/>
-        </w:rPr>
-      </w:pPr>
-      <w:r>
-        <w:rPr>
-          <w:rStyle w:val="n2"/>
-          <w:rFonts w:ascii="Manrope" w:eastAsia="Times New Roman" w:hAnsi="Manrope"/>
-          <w:lang w:val="en"/>
-        </w:rPr>
-        <w:t>2</w:t>
-      </w:r>
-      <w:r>
-        <w:rPr>
-          <w:rFonts w:ascii="Manrope" w:eastAsia="Times New Roman" w:hAnsi="Manrope"/>
-          <w:lang w:val="en"/>
-        </w:rPr>
-        <w:t>Adding &amp; finding patients</w:t>
-      </w:r>
-    </w:p>
-    <w:p>
-      <w:pPr>
-        <w:pStyle w:val="NormalWeb"/>
-        <w:rPr>
-          <w:rFonts w:ascii="Manrope" w:hAnsi="Manrope"/>
-          <w:sz w:val="22"/>
-          <w:szCs w:val="22"/>
-          <w:lang w:val="en"/>
-        </w:rPr>
-      </w:pPr>
-      <w:r>
-        <w:rPr>
-          <w:rFonts w:ascii="Manrope" w:hAnsi="Manrope"/>
-          <w:sz w:val="22"/>
-          <w:szCs w:val="22"/>
-          <w:lang w:val="en"/>
-        </w:rPr>
-        <w:t xml:space="preserve">Open </w:t>
-      </w:r>
-      <w:r>
-        <w:rPr>
-          <w:rFonts w:ascii="Manrope" w:hAnsi="Manrope"/>
-          <w:b/>
-          <w:bCs/>
-          <w:sz w:val="22"/>
-          <w:szCs w:val="22"/>
-          <w:lang w:val="en"/>
-        </w:rPr>
-        <w:t>Patients</w:t>
-      </w:r>
-      <w:r>
-        <w:rPr>
-          <w:rFonts w:ascii="Manrope" w:hAnsi="Manrope"/>
-          <w:sz w:val="22"/>
-          <w:szCs w:val="22"/>
-          <w:lang w:val="en"/>
-        </w:rPr>
-        <w:t xml:space="preserve"> from the sidebar.</w:t>
-      </w:r>
-    </w:p>
-    <w:p>
-      <w:pPr>
-        <w:numPr>
-          <w:ilvl w:val="0"/>
-          <w:numId w:val="2"/>
-        </w:numPr>
-        <w:spacing w:before="100" w:beforeAutospacing="1" w:after="45"/>
-        <w:ind w:left="1020"/>
-        <w:rPr>
-          <w:rFonts w:ascii="Manrope" w:eastAsia="Times New Roman" w:hAnsi="Manrope"/>
-          <w:sz w:val="22"/>
-          <w:szCs w:val="22"/>
-          <w:lang w:val="en"/>
-        </w:rPr>
-      </w:pPr>
-      <w:r>
-        <w:rPr>
-          <w:rFonts w:ascii="Manrope" w:eastAsia="Times New Roman" w:hAnsi="Manrope"/>
-          <w:b/>
-          <w:bCs/>
-          <w:sz w:val="22"/>
-          <w:szCs w:val="22"/>
-          <w:lang w:val="en"/>
-        </w:rPr>
-        <w:lastRenderedPageBreak/>
-        <w:t>Add a patient:</w:t>
-      </w:r>
-      <w:r>
-        <w:rPr>
-          <w:rFonts w:ascii="Manrope" w:eastAsia="Times New Roman" w:hAnsi="Manrope"/>
-          <w:sz w:val="22"/>
-          <w:szCs w:val="22"/>
-          <w:lang w:val="en"/>
-        </w:rPr>
-        <w:t xml:space="preserve"> click </w:t>
-      </w:r>
-      <w:r>
-        <w:rPr>
-          <w:rFonts w:ascii="Manrope" w:eastAsia="Times New Roman" w:hAnsi="Manrope"/>
-          <w:b/>
-          <w:bCs/>
-          <w:sz w:val="22"/>
-          <w:szCs w:val="22"/>
-          <w:lang w:val="en"/>
-        </w:rPr>
-        <w:t>+ New Patient</w:t>
-      </w:r>
-      <w:r>
-        <w:rPr>
-          <w:rFonts w:ascii="Manrope" w:eastAsia="Times New Roman" w:hAnsi="Manrope"/>
-          <w:sz w:val="22"/>
-          <w:szCs w:val="22"/>
-          <w:lang w:val="en"/>
-        </w:rPr>
-        <w:t xml:space="preserve"> </w:t>
-      </w:r>
-      <w:r>
-        <w:rPr>
-          <w:rFonts w:ascii="Manrope" w:eastAsia="Times New Roman" w:hAnsi="Manrope"/>
-          <w:sz w:val="22"/>
-          <w:szCs w:val="22"/>
-          <w:lang w:val="en"/>
-        </w:rPr>
-        <w:t>and enter their details. Search is case-insensitive — type any part of a name to find someone.</w:t>
-      </w:r>
-    </w:p>
-    <w:p>
-      <w:pPr>
-        <w:numPr>
-          <w:ilvl w:val="0"/>
-          <w:numId w:val="2"/>
-        </w:numPr>
-        <w:spacing w:before="100" w:beforeAutospacing="1" w:after="45"/>
-        <w:ind w:left="1020"/>
-        <w:rPr>
-          <w:rFonts w:ascii="Manrope" w:eastAsia="Times New Roman" w:hAnsi="Manrope"/>
-          <w:sz w:val="22"/>
-          <w:szCs w:val="22"/>
-          <w:lang w:val="en"/>
-        </w:rPr>
-      </w:pPr>
-      <w:r>
-        <w:rPr>
-          <w:rFonts w:ascii="Manrope" w:eastAsia="Times New Roman" w:hAnsi="Manrope"/>
-          <w:sz w:val="22"/>
-          <w:szCs w:val="22"/>
-          <w:lang w:val="en"/>
-        </w:rPr>
-        <w:t>Open a patient to see their information and order history.</w:t>
-      </w:r>
-    </w:p>
-    <w:p>
-      <w:pPr>
-        <w:pStyle w:val="Heading2"/>
-        <w:rPr>
-          <w:rFonts w:ascii="Manrope" w:eastAsia="Times New Roman" w:hAnsi="Manrope"/>
-          <w:lang w:val="en"/>
-        </w:rPr>
-      </w:pPr>
-      <w:r>
-        <w:rPr>
-          <w:rStyle w:val="n2"/>
-          <w:rFonts w:ascii="Manrope" w:eastAsia="Times New Roman" w:hAnsi="Manrope"/>
-          <w:lang w:val="en"/>
-        </w:rPr>
-        <w:t>3</w:t>
-      </w:r>
-      <w:r>
-        <w:rPr>
-          <w:rFonts w:ascii="Manrope" w:eastAsia="Times New Roman" w:hAnsi="Manrope"/>
-          <w:lang w:val="en"/>
-        </w:rPr>
-        <w:t>Placing orders</w:t>
-      </w:r>
-    </w:p>
-    <w:p>
-      <w:pPr>
-        <w:pStyle w:val="NormalWeb"/>
-        <w:rPr>
-          <w:rFonts w:ascii="Manrope" w:hAnsi="Manrope"/>
-          <w:sz w:val="22"/>
-          <w:szCs w:val="22"/>
-          <w:lang w:val="en"/>
-        </w:rPr>
-      </w:pPr>
-      <w:r>
-        <w:rPr>
-          <w:rFonts w:ascii="Manrope" w:hAnsi="Manrope"/>
-          <w:sz w:val="22"/>
-          <w:szCs w:val="22"/>
-          <w:lang w:val="en"/>
-        </w:rPr>
-        <w:t>There are three order types, each on its own sidebar item. Pick the one that fits how the supplies are billed:</w:t>
-      </w:r>
-    </w:p>
-    <w:p>
-      <w:pPr>
-        <w:spacing w:before="100" w:beforeAutospacing="1" w:after="30"/>
-        <w:outlineLvl w:val="4"/>
-        <w:divId w:val="1169757066"/>
-        <w:rPr>
-          <w:rFonts w:ascii="Manrope" w:eastAsia="Times New Roman" w:hAnsi="Manrope"/>
-          <w:b/>
-          <w:bCs/>
-          <w:sz w:val="17"/>
-          <w:szCs w:val="17"/>
-          <w:lang w:val="en"/>
-        </w:rPr>
-      </w:pPr>
-      <w:r>
-        <w:rPr>
-          <w:rFonts w:ascii="Manrope" w:eastAsia="Times New Roman" w:hAnsi="Manrope"/>
-          <w:b/>
-          <w:bCs/>
-          <w:sz w:val="17"/>
-          <w:szCs w:val="17"/>
-          <w:lang w:val="en"/>
-        </w:rPr>
-        <w:t>Patient Referral</w:t>
-      </w:r>
-    </w:p>
-    <w:p>
-      <w:pPr>
-        <w:divId w:val="1169757066"/>
-        <w:rPr>
-          <w:rFonts w:ascii="Manrope" w:hAnsi="Manrope"/>
-          <w:sz w:val="15"/>
-          <w:szCs w:val="15"/>
-          <w:lang w:val="en"/>
-        </w:rPr>
-      </w:pPr>
-      <w:r>
-        <w:rPr>
-          <w:rFonts w:ascii="Manrope" w:hAnsi="Manrope"/>
-          <w:sz w:val="15"/>
-          <w:szCs w:val="15"/>
-          <w:lang w:val="en"/>
-        </w:rPr>
-        <w:t>Insurance-billed supplies for a specific patient (collagen and advanced dressings). Ships by the piece.</w:t>
-      </w:r>
-    </w:p>
-    <w:p>
-      <w:pPr>
-        <w:spacing w:before="100" w:beforeAutospacing="1" w:after="30"/>
-        <w:outlineLvl w:val="4"/>
-        <w:divId w:val="731077982"/>
-        <w:rPr>
-          <w:rFonts w:ascii="Manrope" w:eastAsia="Times New Roman" w:hAnsi="Manrope"/>
-          <w:b/>
-          <w:bCs/>
-          <w:sz w:val="17"/>
-          <w:szCs w:val="17"/>
-          <w:lang w:val="en"/>
-        </w:rPr>
-      </w:pPr>
-      <w:r>
-        <w:rPr>
-          <w:rFonts w:ascii="Manrope" w:eastAsia="Times New Roman" w:hAnsi="Manrope"/>
-          <w:b/>
-          <w:bCs/>
-          <w:sz w:val="17"/>
-          <w:szCs w:val="17"/>
-          <w:lang w:val="en"/>
-        </w:rPr>
-        <w:t>HealKit Order</w:t>
-      </w:r>
-    </w:p>
-    <w:p>
-      <w:pPr>
-        <w:divId w:val="731077982"/>
-        <w:rPr>
-          <w:rFonts w:ascii="Manrope" w:hAnsi="Manrope"/>
-          <w:sz w:val="15"/>
-          <w:szCs w:val="15"/>
-          <w:lang w:val="en"/>
-        </w:rPr>
-      </w:pPr>
-      <w:r>
-        <w:rPr>
-          <w:rFonts w:ascii="Manrope" w:hAnsi="Manrope"/>
-          <w:sz w:val="15"/>
-          <w:szCs w:val="15"/>
-          <w:lang w:val="en"/>
-        </w:rPr>
-        <w:t>Simple cash/wholesale supplies — no insurance paperwork. Ships to your office by the piece.</w:t>
-      </w:r>
-    </w:p>
-    <w:p>
-      <w:pPr>
-        <w:spacing w:before="100" w:beforeAutospacing="1" w:after="30"/>
-        <w:outlineLvl w:val="4"/>
-        <w:divId w:val="3364802"/>
-        <w:rPr>
-          <w:rFonts w:ascii="Manrope" w:eastAsia="Times New Roman" w:hAnsi="Manrope"/>
-          <w:b/>
-          <w:bCs/>
-          <w:sz w:val="17"/>
-          <w:szCs w:val="17"/>
-          <w:lang w:val="en"/>
-        </w:rPr>
-      </w:pPr>
-      <w:r>
-        <w:rPr>
-          <w:rFonts w:ascii="Manrope" w:eastAsia="Times New Roman" w:hAnsi="Manrope"/>
-          <w:b/>
-          <w:bCs/>
-          <w:sz w:val="17"/>
-          <w:szCs w:val="17"/>
-          <w:lang w:val="en"/>
-        </w:rPr>
-        <w:t>Wholesale Orders</w:t>
-      </w:r>
-    </w:p>
-    <w:p>
-      <w:pPr>
-        <w:divId w:val="3364802"/>
-        <w:rPr>
-          <w:rFonts w:ascii="Manrope" w:hAnsi="Manrope"/>
-          <w:sz w:val="15"/>
-          <w:szCs w:val="15"/>
-          <w:lang w:val="en"/>
-        </w:rPr>
-      </w:pPr>
-      <w:r>
-        <w:rPr>
-          <w:rFonts w:ascii="Manrope" w:hAnsi="Manrope"/>
-          <w:sz w:val="15"/>
-          <w:szCs w:val="15"/>
-          <w:lang w:val="en"/>
-        </w:rPr>
-        <w:t>Stock for your practice, billed to the facility and shipped by the box.</w:t>
-      </w:r>
-    </w:p>
-    <w:p>
-      <w:pPr>
-        <w:pStyle w:val="Heading3"/>
-        <w:rPr>
-          <w:rFonts w:ascii="Manrope" w:eastAsia="Times New Roman" w:hAnsi="Manrope"/>
-          <w:lang w:val="en"/>
-        </w:rPr>
-      </w:pPr>
-      <w:r>
-        <w:rPr>
-          <w:rFonts w:ascii="Manrope" w:eastAsia="Times New Roman" w:hAnsi="Manrope"/>
-          <w:lang w:val="en"/>
-        </w:rPr>
-        <w:t>Patient Referral (insurance) order</w:t>
-      </w:r>
-    </w:p>
-    <w:p>
-      <w:pPr>
-        <w:numPr>
-          <w:ilvl w:val="0"/>
-          <w:numId w:val="3"/>
-        </w:numPr>
-        <w:spacing w:before="100" w:beforeAutospacing="1" w:after="45"/>
-        <w:ind w:left="1020"/>
-        <w:rPr>
-          <w:rFonts w:ascii="Manrope" w:eastAsia="Times New Roman" w:hAnsi="Manrope"/>
-          <w:sz w:val="22"/>
-          <w:szCs w:val="22"/>
-          <w:lang w:val="en"/>
-        </w:rPr>
-      </w:pPr>
-      <w:r>
-        <w:rPr>
-          <w:rFonts w:ascii="Manrope" w:eastAsia="Times New Roman" w:hAnsi="Manrope"/>
-          <w:sz w:val="22"/>
-          <w:szCs w:val="22"/>
-          <w:lang w:val="en"/>
-        </w:rPr>
-        <w:t xml:space="preserve">Open </w:t>
-      </w:r>
-      <w:r>
-        <w:rPr>
-          <w:rFonts w:ascii="Manrope" w:eastAsia="Times New Roman" w:hAnsi="Manrope"/>
-          <w:b/>
-          <w:bCs/>
-          <w:sz w:val="22"/>
-          <w:szCs w:val="22"/>
-          <w:lang w:val="en"/>
-        </w:rPr>
-        <w:t>Patient Referral</w:t>
-      </w:r>
-      <w:r>
-        <w:rPr>
-          <w:rFonts w:ascii="Manrope" w:eastAsia="Times New Roman" w:hAnsi="Manrope"/>
-          <w:sz w:val="22"/>
-          <w:szCs w:val="22"/>
-          <w:lang w:val="en"/>
-        </w:rPr>
-        <w:t xml:space="preserve"> and choose (or add) the patient.</w:t>
-      </w:r>
-    </w:p>
-    <w:p>
-      <w:pPr>
-        <w:numPr>
-          <w:ilvl w:val="0"/>
-          <w:numId w:val="3"/>
-        </w:numPr>
-        <w:spacing w:before="100" w:beforeAutospacing="1" w:after="45"/>
-        <w:ind w:left="1020"/>
-        <w:rPr>
-          <w:rFonts w:ascii="Manrope" w:eastAsia="Times New Roman" w:hAnsi="Manrope"/>
-          <w:sz w:val="22"/>
-          <w:szCs w:val="22"/>
-          <w:lang w:val="en"/>
-        </w:rPr>
-      </w:pPr>
-      <w:r>
-        <w:rPr>
-          <w:rFonts w:ascii="Manrope" w:eastAsia="Times New Roman" w:hAnsi="Manrope"/>
-          <w:sz w:val="22"/>
-          <w:szCs w:val="22"/>
-          <w:lang w:val="en"/>
-        </w:rPr>
-        <w:t xml:space="preserve">Add the wound(s) and pick the </w:t>
-      </w:r>
-      <w:r>
-        <w:rPr>
-          <w:rFonts w:ascii="Manrope" w:eastAsia="Times New Roman" w:hAnsi="Manrope"/>
-          <w:b/>
-          <w:bCs/>
-          <w:sz w:val="22"/>
-          <w:szCs w:val="22"/>
-          <w:lang w:val="en"/>
-        </w:rPr>
-        <w:t>product type</w:t>
-      </w:r>
-      <w:r>
-        <w:rPr>
-          <w:rFonts w:ascii="Manrope" w:eastAsia="Times New Roman" w:hAnsi="Manrope"/>
-          <w:sz w:val="22"/>
-          <w:szCs w:val="22"/>
-          <w:lang w:val="en"/>
-        </w:rPr>
-        <w:t xml:space="preserve"> and </w:t>
-      </w:r>
-      <w:r>
-        <w:rPr>
-          <w:rFonts w:ascii="Manrope" w:eastAsia="Times New Roman" w:hAnsi="Manrope"/>
-          <w:b/>
-          <w:bCs/>
-          <w:sz w:val="22"/>
-          <w:szCs w:val="22"/>
-          <w:lang w:val="en"/>
-        </w:rPr>
-        <w:t>size</w:t>
-      </w:r>
-      <w:r>
-        <w:rPr>
-          <w:rFonts w:ascii="Manrope" w:eastAsia="Times New Roman" w:hAnsi="Manrope"/>
-          <w:sz w:val="22"/>
-          <w:szCs w:val="22"/>
-          <w:lang w:val="en"/>
-        </w:rPr>
-        <w:t>, then set quantity, frequency, and duration.</w:t>
-      </w:r>
-    </w:p>
-    <w:p>
-      <w:pPr>
-        <w:numPr>
-          <w:ilvl w:val="0"/>
-          <w:numId w:val="3"/>
-        </w:numPr>
-        <w:spacing w:before="100" w:beforeAutospacing="1" w:after="45"/>
-        <w:ind w:left="1020"/>
-        <w:rPr>
-          <w:rFonts w:ascii="Manrope" w:eastAsia="Times New Roman" w:hAnsi="Manrope"/>
-          <w:sz w:val="22"/>
-          <w:szCs w:val="22"/>
-          <w:lang w:val="en"/>
-        </w:rPr>
-      </w:pPr>
-      <w:r>
-        <w:rPr>
-          <w:rFonts w:ascii="Manrope" w:eastAsia="Times New Roman" w:hAnsi="Manrope"/>
-          <w:sz w:val="22"/>
-          <w:szCs w:val="22"/>
-          <w:lang w:val="en"/>
-        </w:rPr>
-        <w:t>Attach any required documentation, sign, and submit.</w:t>
-      </w:r>
-    </w:p>
-    <w:p>
-      <w:pPr>
-        <w:pStyle w:val="Heading3"/>
-        <w:rPr>
-          <w:rFonts w:ascii="Manrope" w:eastAsia="Times New Roman" w:hAnsi="Manrope"/>
-          <w:lang w:val="en"/>
-        </w:rPr>
-      </w:pPr>
-      <w:r>
-        <w:rPr>
-          <w:rFonts w:ascii="Manrope" w:eastAsia="Times New Roman" w:hAnsi="Manrope"/>
-          <w:lang w:val="en"/>
-        </w:rPr>
-        <w:t>HealKit order</w:t>
-      </w:r>
-    </w:p>
-    <w:p>
-      <w:pPr>
-        <w:numPr>
-          <w:ilvl w:val="0"/>
-          <w:numId w:val="4"/>
-        </w:numPr>
-        <w:spacing w:before="100" w:beforeAutospacing="1" w:after="45"/>
-        <w:ind w:left="1020"/>
-        <w:rPr>
-          <w:rFonts w:ascii="Manrope" w:eastAsia="Times New Roman" w:hAnsi="Manrope"/>
-          <w:sz w:val="22"/>
-          <w:szCs w:val="22"/>
-          <w:lang w:val="en"/>
-        </w:rPr>
-      </w:pPr>
-      <w:r>
-        <w:rPr>
-          <w:rFonts w:ascii="Manrope" w:eastAsia="Times New Roman" w:hAnsi="Manrope"/>
-          <w:sz w:val="22"/>
-          <w:szCs w:val="22"/>
-          <w:lang w:val="en"/>
-        </w:rPr>
-        <w:t xml:space="preserve">Open </w:t>
-      </w:r>
-      <w:r>
-        <w:rPr>
-          <w:rFonts w:ascii="Manrope" w:eastAsia="Times New Roman" w:hAnsi="Manrope"/>
-          <w:b/>
-          <w:bCs/>
-          <w:sz w:val="22"/>
-          <w:szCs w:val="22"/>
-          <w:lang w:val="en"/>
-        </w:rPr>
-        <w:t>HealKit Order</w:t>
-      </w:r>
-      <w:r>
-        <w:rPr>
-          <w:rFonts w:ascii="Manrope" w:eastAsia="Times New Roman" w:hAnsi="Manrope"/>
-          <w:sz w:val="22"/>
-          <w:szCs w:val="22"/>
-          <w:lang w:val="en"/>
-        </w:rPr>
-        <w:t>. New patients need only a first and last name — no insurance docs required.</w:t>
-      </w:r>
-    </w:p>
-    <w:p>
-      <w:pPr>
-        <w:numPr>
-          <w:ilvl w:val="0"/>
-          <w:numId w:val="4"/>
-        </w:numPr>
-        <w:spacing w:before="100" w:beforeAutospacing="1" w:after="45"/>
-        <w:ind w:left="1020"/>
-        <w:rPr>
-          <w:rFonts w:ascii="Manrope" w:eastAsia="Times New Roman" w:hAnsi="Manrope"/>
-          <w:sz w:val="22"/>
-          <w:szCs w:val="22"/>
-          <w:lang w:val="en"/>
-        </w:rPr>
-      </w:pPr>
-      <w:r>
-        <w:rPr>
-          <w:rFonts w:ascii="Manrope" w:eastAsia="Times New Roman" w:hAnsi="Manrope"/>
-          <w:sz w:val="22"/>
-          <w:szCs w:val="22"/>
-          <w:lang w:val="en"/>
-        </w:rPr>
-        <w:t>Confirm delivery (defaults to your office; choose another location if needed).</w:t>
-      </w:r>
-    </w:p>
-    <w:p>
-      <w:pPr>
-        <w:numPr>
-          <w:ilvl w:val="0"/>
-          <w:numId w:val="4"/>
-        </w:numPr>
-        <w:spacing w:before="100" w:beforeAutospacing="1" w:after="45"/>
-        <w:ind w:left="1020"/>
-        <w:rPr>
-          <w:rFonts w:ascii="Manrope" w:eastAsia="Times New Roman" w:hAnsi="Manrope"/>
-          <w:sz w:val="22"/>
-          <w:szCs w:val="22"/>
-          <w:lang w:val="en"/>
-        </w:rPr>
-      </w:pPr>
-      <w:r>
-        <w:rPr>
-          <w:rFonts w:ascii="Manrope" w:eastAsia="Times New Roman" w:hAnsi="Manrope"/>
-          <w:sz w:val="22"/>
-          <w:szCs w:val="22"/>
-          <w:lang w:val="en"/>
-        </w:rPr>
-        <w:t>Pick product type and size, set the quantity, sign, and submit.</w:t>
-      </w:r>
-    </w:p>
-    <w:p>
-      <w:pPr>
-        <w:divId w:val="1110125022"/>
-        <w:rPr>
-          <w:rFonts w:ascii="Manrope" w:eastAsia="Times New Roman" w:hAnsi="Manrope"/>
-          <w:sz w:val="16"/>
-          <w:szCs w:val="16"/>
-          <w:lang w:val="en"/>
-        </w:rPr>
-      </w:pPr>
-      <w:r>
-        <w:rPr>
-          <w:rFonts w:ascii="Manrope" w:eastAsia="Times New Roman" w:hAnsi="Manrope"/>
-          <w:b/>
-          <w:bCs/>
-          <w:sz w:val="16"/>
-          <w:szCs w:val="16"/>
-          <w:lang w:val="en"/>
-        </w:rPr>
-        <w:t>What's the difference?</w:t>
-      </w:r>
-      <w:r>
-        <w:rPr>
-          <w:rFonts w:ascii="Manrope" w:eastAsia="Times New Roman" w:hAnsi="Manrope"/>
-          <w:sz w:val="16"/>
-          <w:szCs w:val="16"/>
-          <w:lang w:val="en"/>
-        </w:rPr>
-        <w:t xml:space="preserve"> HealKit skips insurance verification and ships straight to your office at simple wholesale pricing — great when you don't need to bill a patient's insurance. See the dedicated </w:t>
-      </w:r>
-      <w:r>
-        <w:rPr>
-          <w:rFonts w:ascii="Manrope" w:eastAsia="Times New Roman" w:hAnsi="Manrope"/>
-          <w:b/>
-          <w:bCs/>
-          <w:sz w:val="16"/>
-          <w:szCs w:val="16"/>
-          <w:lang w:val="en"/>
-        </w:rPr>
-        <w:t>"Introducing HealKit"</w:t>
-      </w:r>
-      <w:r>
-        <w:rPr>
-          <w:rFonts w:ascii="Manrope" w:eastAsia="Times New Roman" w:hAnsi="Manrope"/>
-          <w:sz w:val="16"/>
-          <w:szCs w:val="16"/>
-          <w:lang w:val="en"/>
-        </w:rPr>
-        <w:t xml:space="preserve"> handout for details.</w:t>
-      </w:r>
-    </w:p>
-    <w:p>
-      <w:pPr>
-        <w:pStyle w:val="Heading3"/>
-        <w:rPr>
-          <w:rFonts w:ascii="Manrope" w:eastAsia="Times New Roman" w:hAnsi="Manrope"/>
-          <w:lang w:val="en"/>
-        </w:rPr>
-      </w:pPr>
-      <w:r>
-        <w:rPr>
-          <w:rFonts w:ascii="Manrope" w:eastAsia="Times New Roman" w:hAnsi="Manrope"/>
-          <w:lang w:val="en"/>
-        </w:rPr>
-        <w:t>Wholesale order</w:t>
-      </w:r>
-    </w:p>
-    <w:p>
-      <w:pPr>
-        <w:numPr>
-          <w:ilvl w:val="0"/>
-          <w:numId w:val="5"/>
-        </w:numPr>
-        <w:spacing w:before="100" w:beforeAutospacing="1" w:after="45"/>
-        <w:ind w:left="1020"/>
-        <w:rPr>
-          <w:rFonts w:ascii="Manrope" w:eastAsia="Times New Roman" w:hAnsi="Manrope"/>
-          <w:sz w:val="22"/>
-          <w:szCs w:val="22"/>
-          <w:lang w:val="en"/>
-        </w:rPr>
-      </w:pPr>
-      <w:r>
-        <w:rPr>
-          <w:rFonts w:ascii="Manrope" w:eastAsia="Times New Roman" w:hAnsi="Manrope"/>
-          <w:sz w:val="22"/>
-          <w:szCs w:val="22"/>
-          <w:lang w:val="en"/>
-        </w:rPr>
-        <w:t xml:space="preserve">Open </w:t>
-      </w:r>
-      <w:r>
-        <w:rPr>
-          <w:rFonts w:ascii="Manrope" w:eastAsia="Times New Roman" w:hAnsi="Manrope"/>
-          <w:b/>
-          <w:bCs/>
-          <w:sz w:val="22"/>
-          <w:szCs w:val="22"/>
-          <w:lang w:val="en"/>
-        </w:rPr>
-        <w:t>Wholesale Orders</w:t>
-      </w:r>
-      <w:r>
-        <w:rPr>
-          <w:rFonts w:ascii="Manrope" w:eastAsia="Times New Roman" w:hAnsi="Manrope"/>
-          <w:sz w:val="22"/>
-          <w:szCs w:val="22"/>
-          <w:lang w:val="en"/>
-        </w:rPr>
-        <w:t xml:space="preserve"> → </w:t>
-      </w:r>
-      <w:r>
-        <w:rPr>
-          <w:rFonts w:ascii="Manrope" w:eastAsia="Times New Roman" w:hAnsi="Manrope"/>
-          <w:b/>
-          <w:bCs/>
-          <w:sz w:val="22"/>
-          <w:szCs w:val="22"/>
-          <w:lang w:val="en"/>
-        </w:rPr>
-        <w:t>Create</w:t>
-      </w:r>
-      <w:r>
-        <w:rPr>
-          <w:rFonts w:ascii="Manrope" w:eastAsia="Times New Roman" w:hAnsi="Manrope"/>
-          <w:sz w:val="22"/>
-          <w:szCs w:val="22"/>
-          <w:lang w:val="en"/>
-        </w:rPr>
-        <w:t>.</w:t>
-      </w:r>
-    </w:p>
-    <w:p>
-      <w:pPr>
-        <w:numPr>
-          <w:ilvl w:val="0"/>
-          <w:numId w:val="5"/>
-        </w:numPr>
-        <w:spacing w:before="100" w:beforeAutospacing="1" w:after="45"/>
-        <w:ind w:left="1020"/>
-        <w:rPr>
-          <w:rFonts w:ascii="Manrope" w:eastAsia="Times New Roman" w:hAnsi="Manrope"/>
-          <w:sz w:val="22"/>
-          <w:szCs w:val="22"/>
-          <w:lang w:val="en"/>
-        </w:rPr>
-      </w:pPr>
-      <w:r>
-        <w:rPr>
-          <w:rFonts w:ascii="Manrope" w:eastAsia="Times New Roman" w:hAnsi="Manrope"/>
-          <w:sz w:val="22"/>
-          <w:szCs w:val="22"/>
-          <w:lang w:val="en"/>
-        </w:rPr>
-        <w:t>Wholesale orders ship to your facility (not a patient). Choose products and quantities (by the box) and submit.</w:t>
-      </w:r>
-    </w:p>
-    <w:p>
-      <w:pPr>
-        <w:divId w:val="2108915043"/>
-        <w:rPr>
-          <w:rFonts w:ascii="Manrope" w:eastAsia="Times New Roman" w:hAnsi="Manrope"/>
-          <w:sz w:val="14"/>
-          <w:szCs w:val="14"/>
-          <w:lang w:val="en"/>
-        </w:rPr>
-      </w:pPr>
-      <w:r>
-        <w:rPr>
-          <w:rFonts w:ascii="Manrope" w:eastAsia="Times New Roman" w:hAnsi="Manrope"/>
-          <w:sz w:val="14"/>
-          <w:szCs w:val="14"/>
-          <w:lang w:val="en"/>
-        </w:rPr>
-        <w:t>CollagenDirect · MD DME — Advanced Wound Care, SimplifiedQuestions? orders@md-dme.com</w:t>
-      </w:r>
-    </w:p>
-    <w:p>
-      <w:pPr>
-        <w:divId w:val="568538940"/>
-        <w:rPr>
-          <w:rFonts w:ascii="Manrope" w:eastAsia="Times New Roman" w:hAnsi="Manrope"/>
-          <w:sz w:val="22"/>
-          <w:szCs w:val="22"/>
-          <w:lang w:val="en"/>
-        </w:rPr>
-      </w:pPr>
-      <w:r>
-        <w:rPr>
-          <w:rFonts w:ascii="Manrope" w:eastAsia="Times New Roman" w:hAnsi="Manrope"/>
-          <w:noProof/>
-          <w:sz w:val="22"/>
-          <w:szCs w:val="22"/>
-          <w:lang w:val="en"/>
-        </w:rPr>
-        <w:lastRenderedPageBreak/>
-        <w:drawing>
-          <wp:inline distT="0" distB="0" distL="0" distR="0" wp14:anchorId="5ADDC5B2" wp14:editId="08F61ACE">
-            <wp:extent cx="20314920" cy="4137660"/>
-            <wp:effectExtent l="0" t="0" r="0" b="0"/>
-            <wp:docPr id="2" name="Picture 2" descr="MD DME"/>
-            <wp:cNvGraphicFramePr>
-              <a:graphicFrameLocks xmlns:a="http://schemas.openxmlformats.org/drawingml/2006/main" noChangeAspect="1"/>
-            </wp:cNvGraphicFramePr>
-            <a:graphic xmlns:a="http://schemas.openxmlformats.org/drawingml/2006/main">
-              <a:graphicData uri="http://schemas.openxmlformats.org/drawingml/2006/picture">
-                <pic:pic xmlns:pic="http://schemas.openxmlformats.org/drawingml/2006/picture">
-                  <pic:nvPicPr>
-                    <pic:cNvPr id="0" name="Picture 2" descr="MD DME"/>
-                    <pic:cNvPicPr>
-                      <a:picLocks noChangeAspect="1" noChangeArrowheads="1"/>
-                    </pic:cNvPicPr>
-                  </pic:nvPicPr>
-                  <pic:blipFill>
-                    <a:blip r:embed="rId5">
-                      <a:extLst>
-                        <a:ext uri="{28A0092B-C50C-407E-A947-70E740481C1C}">
-                          <a14:useLocalDpi xmlns:a14="http://schemas.microsoft.com/office/drawing/2010/main" val="0"/>
-                        </a:ext>
-                      </a:extLst>
-                    </a:blip>
-                    <a:srcRect/>
-                    <a:stretch>
-                      <a:fillRect/>
-                    </a:stretch>
-                  </pic:blipFill>
-                  <pic:spPr bwMode="auto">
-                    <a:xfrm>
-                      <a:off x="0" y="0"/>
-                      <a:ext cx="20314920" cy="4137660"/>
-                    </a:xfrm>
-                    <a:prstGeom prst="rect">
-                      <a:avLst/>
-                    </a:prstGeom>
-                    <a:noFill/>
-                    <a:ln>
-                      <a:noFill/>
-                    </a:ln>
-                  </pic:spPr>
-                </pic:pic>
-              </a:graphicData>
-            </a:graphic>
-          </wp:inline>
-        </w:drawing>
-      </w:r>
-    </w:p>
-    <w:p>
-      <w:pPr>
         <w:divId w:val="1821538560"/>
         <w:rPr>
           <w:rFonts w:ascii="Manrope" w:eastAsia="Times New Roman" w:hAnsi="Manrope"/>
@@ -1392,6 +1403,7 @@
           <w:szCs w:val="22"/>
           <w:lang w:val="en"/>
         </w:rPr>
+        <w:lastRenderedPageBreak/>
         <w:t>Status</w:t>
       </w:r>
       <w:r>
@@ -1686,16 +1698,7 @@
           <w:szCs w:val="22"/>
           <w:lang w:val="en"/>
         </w:rPr>
-        <w:t xml:space="preserve"> </w:t>
-      </w:r>
-      <w:r>
-        <w:rPr>
-          <w:rFonts w:ascii="Manrope" w:eastAsia="Times New Roman" w:hAnsi="Manrope"/>
-          <w:sz w:val="22"/>
-          <w:szCs w:val="22"/>
-          <w:lang w:val="en"/>
-        </w:rPr>
-        <w:t>— communicate with the CollagenDirect team about orders and questions.</w:t>
+        <w:t xml:space="preserve"> — communicate with the CollagenDirect team about orders and questions.</w:t>
       </w:r>
     </w:p>
     <w:p>

</xml_diff>